<commit_message>
feat: added minor changes
</commit_message>
<xml_diff>
--- a/backend/word/PEELINGI CHEMICZNE PEEL MISSION.docx
+++ b/backend/word/PEELINGI CHEMICZNE PEEL MISSION.docx
@@ -7,104 +7,344 @@
         <w:t>P</w:t>
       </w:r>
       <w:r>
-        <w:t>eelingi Chemiczne Peel Mission</w:t>
-      </w:r>
-    </w:p>
-    <w:p>
-      <w:r>
-        <w:t>Zabiegi Peel Mission to cała linia profesjonalnych peelingów chemicznych i terapii skóry. Ich celem jest kontrolowane złuszczanie skóry oraz stymulacja jej regeneracji, dzięki czemu skóra staje się gładsza, jaśniejsza i bardziej napięta.</w:t>
-      </w:r>
-    </w:p>
-    <w:p>
-      <w:r>
-        <w:t xml:space="preserve">To zabiegi oparte na kwasach kosmetycznych o różnym stężeniu i pH, które działają na skórę na różnych poziomach. W zależności od problemu dobiera się odpowiedni kwas lub ich kombinację. </w:t>
-      </w:r>
-    </w:p>
-    <w:p>
-      <w:r>
-        <w:t>Każdy z nich działa trochę inaczej – jedne leczą trądzik, trądzik różowaty, zmniejszają widoczność zaskórników, inne rozjaśniają przebarwienia, a inne odmładzają skórę, a jeszcze inne zmniejszają zaczerwienienia i rumień.</w:t>
-      </w:r>
-    </w:p>
-    <w:p>
-      <w:r>
-        <w:t>Zabiegi Peel Mission dostępne w ofercie salonu:</w:t>
-      </w:r>
-    </w:p>
-    <w:p>
-      <w:r>
-        <w:t>*Asiatic Peel polecany dla skóry wrażliwej, suchej i odwodnionej.</w:t>
-      </w:r>
-    </w:p>
-    <w:p>
-      <w:r>
-        <w:t>Zabieg silnie nawilżający i regenerujący, przywracający hydro-równowagę skóry, odbudowujący barierę naskórkową i wygładzający zmarszczki, powstałe na skutek odwodnienia.</w:t>
-      </w:r>
-    </w:p>
-    <w:p>
-      <w:r>
-        <w:t>* Reti Peel – działanie przeciwstarzeniowe (retinol), silne odmłodzenie, regeneracja i poprawa jakości skóry (zwiększenie produkcji kolagenu i elastyny, zmniejszenie zaskórników oraz wygładzenie struktury skóry, redukcja przebarwień oraz wyrównanie kolorytu skóry, spłycenie zmarszczek oraz zwiększenie jędrności i gęstość skóry)</w:t>
-      </w:r>
-    </w:p>
-    <w:p>
-      <w:r>
-        <w:t>* Lift Peel Lift Peel – lifting i poprawa napięcia skóry.</w:t>
-      </w:r>
-    </w:p>
-    <w:p>
-      <w:r>
-        <w:t xml:space="preserve">Zabieg Lift Peel bazujący na 10% czystym kwasie glicyryzynowym. Składnik ten, dzięki własnościom immunostymulującym i antyoksydacyjnym, pobudza regenerację komórek skóry oraz hamuje działanie hialuronidazy, enzymu rozkładającego naturalny kwas hialuronowy w skórze, który odpowiada za jędrność i nawilżenie skóry. Po zabiegu widoczna jest znacząca poprawa sprężystości napięcia i wygładzenia cery. </w:t>
-      </w:r>
-    </w:p>
-    <w:p>
-      <w:r>
-        <w:t xml:space="preserve">* DepiGen - zabieg przeznaczony głównie do redukcji przebarwień skóry o różnej etiologii i wyrównania kolorytu cery. Jest to rodzaj peelingu chemicznego, ale stosunkowo łagodnego, dlatego często wykonuje się go w gabinetach kosmetologicznych przez cały rok. Poprzez hamowanie produkcji melaniny, ogranicza również powstawanie nowych przebarwień. </w:t>
-      </w:r>
-    </w:p>
-    <w:p>
-      <w:r>
-        <w:t>* Monoacid Therapy – terapia pojedynczym kwasem dobranym do problemu skóry</w:t>
-      </w:r>
-    </w:p>
-    <w:p>
-      <w:r>
-        <w:t>Dla najlepszych efektów zaleca się wykonanie w zależności od zabiegu serii 2 – 6 zabiegów, w odstępach 1-3 tygodni.</w:t>
-      </w:r>
-    </w:p>
-    <w:p/>
-    <w:p>
-      <w:r>
-        <w:t>Efekty to m.in.:</w:t>
-      </w:r>
-    </w:p>
-    <w:p>
-      <w:r>
-        <w:lastRenderedPageBreak/>
-        <w:t>* gładsza i jaśniejsza skóra</w:t>
-      </w:r>
-    </w:p>
-    <w:p>
-      <w:r>
-        <w:t>* mniej zaskórników i wyprysków</w:t>
-      </w:r>
-    </w:p>
-    <w:p>
-      <w:r>
-        <w:t>* spłycenie zmarszczek</w:t>
-      </w:r>
-    </w:p>
-    <w:p>
-      <w:r>
-        <w:t>* redukcja przebarwień</w:t>
-      </w:r>
-    </w:p>
-    <w:p>
-      <w:r>
-        <w:t>* poprawa gęstości skóry</w:t>
-      </w:r>
-    </w:p>
-    <w:p>
-      <w:r>
-        <w:t>* regeneracja skóry</w:t>
+        <w:t xml:space="preserve">eelingi Chemiczne </w:t>
+      </w:r>
+      <w:proofErr w:type="spellStart"/>
+      <w:r>
+        <w:t>Peel</w:t>
+      </w:r>
+      <w:proofErr w:type="spellEnd"/>
+      <w:r>
+        <w:t xml:space="preserve"> </w:t>
+      </w:r>
+      <w:proofErr w:type="spellStart"/>
+      <w:r>
+        <w:t>Mission</w:t>
+      </w:r>
+      <w:proofErr w:type="spellEnd"/>
+    </w:p>
+    <w:p>
+      <w:r>
+        <w:rPr>
+          <w:b/>
+          <w:bCs/>
+        </w:rPr>
+        <w:t xml:space="preserve">Zabiegi </w:t>
+      </w:r>
+      <w:proofErr w:type="spellStart"/>
+      <w:r>
+        <w:rPr>
+          <w:b/>
+          <w:bCs/>
+        </w:rPr>
+        <w:t>Peel</w:t>
+      </w:r>
+      <w:proofErr w:type="spellEnd"/>
+      <w:r>
+        <w:rPr>
+          <w:b/>
+          <w:bCs/>
+        </w:rPr>
+        <w:t xml:space="preserve"> </w:t>
+      </w:r>
+      <w:proofErr w:type="spellStart"/>
+      <w:r>
+        <w:rPr>
+          <w:b/>
+          <w:bCs/>
+        </w:rPr>
+        <w:t>Mission</w:t>
+      </w:r>
+      <w:proofErr w:type="spellEnd"/>
+      <w:r>
+        <w:t xml:space="preserve"> to linia profesjonalnych peelingów chemicznych i terapii skórnych. Ich celem jest kontrolowane złuszczanie oraz stymulacja regeneracji, dzięki czemu cera staje się gładsza, jaśniejsza i bardziej napięta.</w:t>
+      </w:r>
+    </w:p>
+    <w:p>
+      <w:r>
+        <w:t xml:space="preserve">Terapie opierają się na kwasach o różnym stężeniu i </w:t>
+      </w:r>
+      <w:proofErr w:type="spellStart"/>
+      <w:r>
+        <w:t>pH</w:t>
+      </w:r>
+      <w:proofErr w:type="spellEnd"/>
+      <w:r>
+        <w:t>. W zależności od potrzeb (trądzik, przebarwienia, zmarszczki czy naczynka), dobiera się odpowiedni preparat lub ich kombinację.</w:t>
+      </w:r>
+    </w:p>
+    <w:p>
+      <w:r>
+        <w:rPr>
+          <w:b/>
+          <w:bCs/>
+        </w:rPr>
+        <w:t>Dostępne zabiegi:</w:t>
+      </w:r>
+    </w:p>
+    <w:p>
+      <w:pPr>
+        <w:numPr>
+          <w:ilvl w:val="0"/>
+          <w:numId w:val="1"/>
+        </w:numPr>
+      </w:pPr>
+      <w:proofErr w:type="spellStart"/>
+      <w:r>
+        <w:rPr>
+          <w:b/>
+          <w:bCs/>
+        </w:rPr>
+        <w:t>Asiatic</w:t>
+      </w:r>
+      <w:proofErr w:type="spellEnd"/>
+      <w:r>
+        <w:rPr>
+          <w:b/>
+          <w:bCs/>
+        </w:rPr>
+        <w:t xml:space="preserve"> </w:t>
+      </w:r>
+      <w:proofErr w:type="spellStart"/>
+      <w:r>
+        <w:rPr>
+          <w:b/>
+          <w:bCs/>
+        </w:rPr>
+        <w:t>Peel</w:t>
+      </w:r>
+      <w:proofErr w:type="spellEnd"/>
+      <w:r>
+        <w:rPr>
+          <w:b/>
+          <w:bCs/>
+        </w:rPr>
+        <w:t>:</w:t>
+      </w:r>
+      <w:r>
+        <w:t xml:space="preserve"> dla skóry wrażliwej i odwodnionej. Silnie nawilża, odbudowuje barierę naskórkową i wygładza zmarszczki wynikające z przesuszenia.</w:t>
+      </w:r>
+    </w:p>
+    <w:p>
+      <w:pPr>
+        <w:numPr>
+          <w:ilvl w:val="0"/>
+          <w:numId w:val="1"/>
+        </w:numPr>
+      </w:pPr>
+      <w:proofErr w:type="spellStart"/>
+      <w:r>
+        <w:rPr>
+          <w:b/>
+          <w:bCs/>
+        </w:rPr>
+        <w:t>Reti</w:t>
+      </w:r>
+      <w:proofErr w:type="spellEnd"/>
+      <w:r>
+        <w:rPr>
+          <w:b/>
+          <w:bCs/>
+        </w:rPr>
+        <w:t xml:space="preserve"> </w:t>
+      </w:r>
+      <w:proofErr w:type="spellStart"/>
+      <w:r>
+        <w:rPr>
+          <w:b/>
+          <w:bCs/>
+        </w:rPr>
+        <w:t>Peel</w:t>
+      </w:r>
+      <w:proofErr w:type="spellEnd"/>
+      <w:r>
+        <w:rPr>
+          <w:b/>
+          <w:bCs/>
+        </w:rPr>
+        <w:t>:</w:t>
+      </w:r>
+      <w:r>
+        <w:t xml:space="preserve"> intensywne odmłodzenie oparte na retinolu. Zwiększa produkcję kolagenu, redukuje zaskórniki, przebarwienia oraz poprawia gęstość skóry.</w:t>
+      </w:r>
+    </w:p>
+    <w:p>
+      <w:pPr>
+        <w:numPr>
+          <w:ilvl w:val="0"/>
+          <w:numId w:val="1"/>
+        </w:numPr>
+      </w:pPr>
+      <w:r>
+        <w:rPr>
+          <w:b/>
+          <w:bCs/>
+        </w:rPr>
+        <w:t xml:space="preserve">Lift </w:t>
+      </w:r>
+      <w:proofErr w:type="spellStart"/>
+      <w:r>
+        <w:rPr>
+          <w:b/>
+          <w:bCs/>
+        </w:rPr>
+        <w:t>Peel</w:t>
+      </w:r>
+      <w:proofErr w:type="spellEnd"/>
+      <w:r>
+        <w:rPr>
+          <w:b/>
+          <w:bCs/>
+        </w:rPr>
+        <w:t>:</w:t>
+      </w:r>
+      <w:r>
+        <w:t xml:space="preserve"> zabieg liftingujący bazujący na 10% czystym kwasie </w:t>
+      </w:r>
+      <w:proofErr w:type="spellStart"/>
+      <w:r>
+        <w:t>glicyryzynowym</w:t>
+      </w:r>
+      <w:proofErr w:type="spellEnd"/>
+      <w:r>
+        <w:t>. Hamuje utratę naturalnego kwasu hialuronowego, poprawiając sprężystość i napięcie cery.</w:t>
+      </w:r>
+    </w:p>
+    <w:p>
+      <w:pPr>
+        <w:numPr>
+          <w:ilvl w:val="0"/>
+          <w:numId w:val="1"/>
+        </w:numPr>
+      </w:pPr>
+      <w:proofErr w:type="spellStart"/>
+      <w:r>
+        <w:rPr>
+          <w:b/>
+          <w:bCs/>
+        </w:rPr>
+        <w:t>DepiGen</w:t>
+      </w:r>
+      <w:proofErr w:type="spellEnd"/>
+      <w:r>
+        <w:rPr>
+          <w:b/>
+          <w:bCs/>
+        </w:rPr>
+        <w:t>:</w:t>
+      </w:r>
+      <w:r>
+        <w:t xml:space="preserve"> łagodny peeling redukujący przebarwienia i hamujący powstawanie nowych. Można go wykonywać bezpiecznie przez cały rok.</w:t>
+      </w:r>
+    </w:p>
+    <w:p>
+      <w:pPr>
+        <w:numPr>
+          <w:ilvl w:val="0"/>
+          <w:numId w:val="1"/>
+        </w:numPr>
+      </w:pPr>
+      <w:proofErr w:type="spellStart"/>
+      <w:r>
+        <w:rPr>
+          <w:b/>
+          <w:bCs/>
+        </w:rPr>
+        <w:t>Monoacid</w:t>
+      </w:r>
+      <w:proofErr w:type="spellEnd"/>
+      <w:r>
+        <w:rPr>
+          <w:b/>
+          <w:bCs/>
+        </w:rPr>
+        <w:t xml:space="preserve"> </w:t>
+      </w:r>
+      <w:proofErr w:type="spellStart"/>
+      <w:r>
+        <w:rPr>
+          <w:b/>
+          <w:bCs/>
+        </w:rPr>
+        <w:t>Therapy</w:t>
+      </w:r>
+      <w:proofErr w:type="spellEnd"/>
+      <w:r>
+        <w:rPr>
+          <w:b/>
+          <w:bCs/>
+        </w:rPr>
+        <w:t>:</w:t>
+      </w:r>
+      <w:r>
+        <w:t xml:space="preserve"> terapia kwasem dobranym pod konkretny problem skóry.</w:t>
+      </w:r>
+    </w:p>
+    <w:p>
+      <w:r>
+        <w:t xml:space="preserve">Dla najlepszych efektów zaleca się serię </w:t>
+      </w:r>
+      <w:r>
+        <w:rPr>
+          <w:b/>
+          <w:bCs/>
+        </w:rPr>
+        <w:t>2–6 zabiegów</w:t>
+      </w:r>
+      <w:r>
+        <w:t xml:space="preserve"> w odstępach </w:t>
+      </w:r>
+      <w:r>
+        <w:rPr>
+          <w:b/>
+          <w:bCs/>
+        </w:rPr>
+        <w:t>1–3 tygodni</w:t>
+      </w:r>
+      <w:r>
+        <w:t>.</w:t>
+      </w:r>
+    </w:p>
+    <w:p>
+      <w:r>
+        <w:rPr>
+          <w:b/>
+          <w:bCs/>
+        </w:rPr>
+        <w:t>Główne efekty:</w:t>
+      </w:r>
+    </w:p>
+    <w:p>
+      <w:pPr>
+        <w:numPr>
+          <w:ilvl w:val="0"/>
+          <w:numId w:val="2"/>
+        </w:numPr>
+      </w:pPr>
+      <w:r>
+        <w:t>wyraźne wygładzenie i rozjaśnienie,</w:t>
+      </w:r>
+    </w:p>
+    <w:p>
+      <w:pPr>
+        <w:numPr>
+          <w:ilvl w:val="0"/>
+          <w:numId w:val="2"/>
+        </w:numPr>
+      </w:pPr>
+      <w:r>
+        <w:t>redukcja niedoskonałości i przebarwień,</w:t>
+      </w:r>
+    </w:p>
+    <w:p>
+      <w:pPr>
+        <w:numPr>
+          <w:ilvl w:val="0"/>
+          <w:numId w:val="2"/>
+        </w:numPr>
+      </w:pPr>
+      <w:r>
+        <w:t>spłycenie zmarszczek i poprawa gęstości skóry.</w:t>
       </w:r>
     </w:p>
     <w:p/>
@@ -142,6 +382,7 @@
     <w:p/>
     <w:p>
       <w:r>
+        <w:lastRenderedPageBreak/>
         <w:t>Czas zabiegu 45-70 minut</w:t>
       </w:r>
     </w:p>
@@ -183,8 +424,13 @@
     </w:p>
     <w:p>
       <w:r>
-        <w:t>* trądzik i blizny potrądzikowe</w:t>
-      </w:r>
+        <w:t xml:space="preserve">* trądzik i blizny </w:t>
+      </w:r>
+      <w:proofErr w:type="spellStart"/>
+      <w:r>
+        <w:t>potrądzikowe</w:t>
+      </w:r>
+      <w:proofErr w:type="spellEnd"/>
     </w:p>
     <w:p>
       <w:r>
@@ -195,7 +441,6 @@
     <w:p/>
     <w:p>
       <w:r>
-        <w:lastRenderedPageBreak/>
         <w:t>Bezwzględne przeciwwskazania:</w:t>
       </w:r>
     </w:p>
@@ -236,7 +481,23 @@
     </w:p>
     <w:p>
       <w:r>
-        <w:t>* terapia retinoidami (np. izotretynoina)</w:t>
+        <w:t xml:space="preserve">* terapia </w:t>
+      </w:r>
+      <w:proofErr w:type="spellStart"/>
+      <w:r>
+        <w:t>retinoidami</w:t>
+      </w:r>
+      <w:proofErr w:type="spellEnd"/>
+      <w:r>
+        <w:t xml:space="preserve"> (np. </w:t>
+      </w:r>
+      <w:proofErr w:type="spellStart"/>
+      <w:r>
+        <w:t>izotretynoina</w:t>
+      </w:r>
+      <w:proofErr w:type="spellEnd"/>
+      <w:r>
+        <w:t>)</w:t>
       </w:r>
     </w:p>
     <w:p/>
@@ -278,6 +539,7 @@
         <w:rPr>
           <w:rFonts w:ascii="Segoe UI Symbol" w:hAnsi="Segoe UI Symbol" w:cs="Segoe UI Symbol"/>
         </w:rPr>
+        <w:lastRenderedPageBreak/>
         <w:t xml:space="preserve">* </w:t>
       </w:r>
       <w:r>
@@ -362,6 +624,315 @@
     </w:p>
   </w:footnote>
 </w:footnotes>
+</file>
+
+<file path=word/numbering.xml><?xml version="1.0" encoding="utf-8"?>
+<w:numbering xmlns:wpc="http://schemas.microsoft.com/office/word/2010/wordprocessingCanvas" xmlns:cx="http://schemas.microsoft.com/office/drawing/2014/chartex" xmlns:cx1="http://schemas.microsoft.com/office/drawing/2015/9/8/chartex" xmlns:cx2="http://schemas.microsoft.com/office/drawing/2015/10/21/chartex" xmlns:cx3="http://schemas.microsoft.com/office/drawing/2016/5/9/chartex" xmlns:cx4="http://schemas.microsoft.com/office/drawing/2016/5/10/chartex" xmlns:cx5="http://schemas.microsoft.com/office/drawing/2016/5/11/chartex" xmlns:cx6="http://schemas.microsoft.com/office/drawing/2016/5/12/chartex" xmlns:cx7="http://schemas.microsoft.com/office/drawing/2016/5/13/chartex" xmlns:cx8="http://schemas.microsoft.com/office/drawing/2016/5/14/chartex" xmlns:mc="http://schemas.openxmlformats.org/markup-compatibility/2006" xmlns:aink="http://schemas.microsoft.com/office/drawing/2016/ink" xmlns:am3d="http://schemas.microsoft.com/office/drawing/2017/model3d" xmlns:o="urn:schemas-microsoft-com:office:office" xmlns:oel="http://schemas.microsoft.com/office/2019/extlst" xmlns:r="http://schemas.openxmlformats.org/officeDocument/2006/relationships" xmlns:m="http://schemas.openxmlformats.org/officeDocument/2006/math" xmlns:v="urn:schemas-microsoft-com:vml" xmlns:wp14="http://schemas.microsoft.com/office/word/2010/wordprocessingDrawing" xmlns:wp="http://schemas.openxmlformats.org/drawingml/2006/wordprocessingDrawing" xmlns:w10="urn:schemas-microsoft-com:office:word" xmlns:w="http://schemas.openxmlformats.org/wordprocessingml/2006/main" xmlns:w14="http://schemas.microsoft.com/office/word/2010/wordml" xmlns:w15="http://schemas.microsoft.com/office/word/2012/wordml" xmlns:w16cex="http://schemas.microsoft.com/office/word/2018/wordml/cex" xmlns:w16cid="http://schemas.microsoft.com/office/word/2016/wordml/cid" xmlns:w16="http://schemas.microsoft.com/office/word/2018/wordml" xmlns:w16du="http://schemas.microsoft.com/office/word/2023/wordml/word16du" xmlns:w16sdtdh="http://schemas.microsoft.com/office/word/2020/wordml/sdtdatahash" xmlns:w16sdtfl="http://schemas.microsoft.com/office/word/2024/wordml/sdtformatlock" xmlns:w16se="http://schemas.microsoft.com/office/word/2015/wordml/symex" xmlns:wpg="http://schemas.microsoft.com/office/word/2010/wordprocessingGroup" xmlns:wpi="http://schemas.microsoft.com/office/word/2010/wordprocessingInk" xmlns:wne="http://schemas.microsoft.com/office/word/2006/wordml" xmlns:wps="http://schemas.microsoft.com/office/word/2010/wordprocessingShape" mc:Ignorable="w14 w15 w16se w16cid w16 w16cex w16sdtdh w16sdtfl w16du wp14">
+  <w:abstractNum w:abstractNumId="0" w15:restartNumberingAfterBreak="0">
+    <w:nsid w:val="32813359"/>
+    <w:multiLevelType w:val="multilevel"/>
+    <w:tmpl w:val="435A4E06"/>
+    <w:lvl w:ilvl="0">
+      <w:start w:val="1"/>
+      <w:numFmt w:val="bullet"/>
+      <w:lvlText w:val=""/>
+      <w:lvlJc w:val="left"/>
+      <w:pPr>
+        <w:tabs>
+          <w:tab w:val="num" w:pos="720"/>
+        </w:tabs>
+        <w:ind w:left="720" w:hanging="360"/>
+      </w:pPr>
+      <w:rPr>
+        <w:rFonts w:ascii="Symbol" w:hAnsi="Symbol" w:hint="default"/>
+        <w:sz w:val="20"/>
+      </w:rPr>
+    </w:lvl>
+    <w:lvl w:ilvl="1" w:tentative="1">
+      <w:start w:val="1"/>
+      <w:numFmt w:val="bullet"/>
+      <w:lvlText w:val="o"/>
+      <w:lvlJc w:val="left"/>
+      <w:pPr>
+        <w:tabs>
+          <w:tab w:val="num" w:pos="1440"/>
+        </w:tabs>
+        <w:ind w:left="1440" w:hanging="360"/>
+      </w:pPr>
+      <w:rPr>
+        <w:rFonts w:ascii="Courier New" w:hAnsi="Courier New" w:hint="default"/>
+        <w:sz w:val="20"/>
+      </w:rPr>
+    </w:lvl>
+    <w:lvl w:ilvl="2" w:tentative="1">
+      <w:start w:val="1"/>
+      <w:numFmt w:val="bullet"/>
+      <w:lvlText w:val=""/>
+      <w:lvlJc w:val="left"/>
+      <w:pPr>
+        <w:tabs>
+          <w:tab w:val="num" w:pos="2160"/>
+        </w:tabs>
+        <w:ind w:left="2160" w:hanging="360"/>
+      </w:pPr>
+      <w:rPr>
+        <w:rFonts w:ascii="Wingdings" w:hAnsi="Wingdings" w:hint="default"/>
+        <w:sz w:val="20"/>
+      </w:rPr>
+    </w:lvl>
+    <w:lvl w:ilvl="3" w:tentative="1">
+      <w:start w:val="1"/>
+      <w:numFmt w:val="bullet"/>
+      <w:lvlText w:val=""/>
+      <w:lvlJc w:val="left"/>
+      <w:pPr>
+        <w:tabs>
+          <w:tab w:val="num" w:pos="2880"/>
+        </w:tabs>
+        <w:ind w:left="2880" w:hanging="360"/>
+      </w:pPr>
+      <w:rPr>
+        <w:rFonts w:ascii="Wingdings" w:hAnsi="Wingdings" w:hint="default"/>
+        <w:sz w:val="20"/>
+      </w:rPr>
+    </w:lvl>
+    <w:lvl w:ilvl="4" w:tentative="1">
+      <w:start w:val="1"/>
+      <w:numFmt w:val="bullet"/>
+      <w:lvlText w:val=""/>
+      <w:lvlJc w:val="left"/>
+      <w:pPr>
+        <w:tabs>
+          <w:tab w:val="num" w:pos="3600"/>
+        </w:tabs>
+        <w:ind w:left="3600" w:hanging="360"/>
+      </w:pPr>
+      <w:rPr>
+        <w:rFonts w:ascii="Wingdings" w:hAnsi="Wingdings" w:hint="default"/>
+        <w:sz w:val="20"/>
+      </w:rPr>
+    </w:lvl>
+    <w:lvl w:ilvl="5" w:tentative="1">
+      <w:start w:val="1"/>
+      <w:numFmt w:val="bullet"/>
+      <w:lvlText w:val=""/>
+      <w:lvlJc w:val="left"/>
+      <w:pPr>
+        <w:tabs>
+          <w:tab w:val="num" w:pos="4320"/>
+        </w:tabs>
+        <w:ind w:left="4320" w:hanging="360"/>
+      </w:pPr>
+      <w:rPr>
+        <w:rFonts w:ascii="Wingdings" w:hAnsi="Wingdings" w:hint="default"/>
+        <w:sz w:val="20"/>
+      </w:rPr>
+    </w:lvl>
+    <w:lvl w:ilvl="6" w:tentative="1">
+      <w:start w:val="1"/>
+      <w:numFmt w:val="bullet"/>
+      <w:lvlText w:val=""/>
+      <w:lvlJc w:val="left"/>
+      <w:pPr>
+        <w:tabs>
+          <w:tab w:val="num" w:pos="5040"/>
+        </w:tabs>
+        <w:ind w:left="5040" w:hanging="360"/>
+      </w:pPr>
+      <w:rPr>
+        <w:rFonts w:ascii="Wingdings" w:hAnsi="Wingdings" w:hint="default"/>
+        <w:sz w:val="20"/>
+      </w:rPr>
+    </w:lvl>
+    <w:lvl w:ilvl="7" w:tentative="1">
+      <w:start w:val="1"/>
+      <w:numFmt w:val="bullet"/>
+      <w:lvlText w:val=""/>
+      <w:lvlJc w:val="left"/>
+      <w:pPr>
+        <w:tabs>
+          <w:tab w:val="num" w:pos="5760"/>
+        </w:tabs>
+        <w:ind w:left="5760" w:hanging="360"/>
+      </w:pPr>
+      <w:rPr>
+        <w:rFonts w:ascii="Wingdings" w:hAnsi="Wingdings" w:hint="default"/>
+        <w:sz w:val="20"/>
+      </w:rPr>
+    </w:lvl>
+    <w:lvl w:ilvl="8" w:tentative="1">
+      <w:start w:val="1"/>
+      <w:numFmt w:val="bullet"/>
+      <w:lvlText w:val=""/>
+      <w:lvlJc w:val="left"/>
+      <w:pPr>
+        <w:tabs>
+          <w:tab w:val="num" w:pos="6480"/>
+        </w:tabs>
+        <w:ind w:left="6480" w:hanging="360"/>
+      </w:pPr>
+      <w:rPr>
+        <w:rFonts w:ascii="Wingdings" w:hAnsi="Wingdings" w:hint="default"/>
+        <w:sz w:val="20"/>
+      </w:rPr>
+    </w:lvl>
+  </w:abstractNum>
+  <w:abstractNum w:abstractNumId="1" w15:restartNumberingAfterBreak="0">
+    <w:nsid w:val="7B7804A3"/>
+    <w:multiLevelType w:val="multilevel"/>
+    <w:tmpl w:val="20C2135E"/>
+    <w:lvl w:ilvl="0">
+      <w:start w:val="1"/>
+      <w:numFmt w:val="bullet"/>
+      <w:lvlText w:val=""/>
+      <w:lvlJc w:val="left"/>
+      <w:pPr>
+        <w:tabs>
+          <w:tab w:val="num" w:pos="720"/>
+        </w:tabs>
+        <w:ind w:left="720" w:hanging="360"/>
+      </w:pPr>
+      <w:rPr>
+        <w:rFonts w:ascii="Symbol" w:hAnsi="Symbol" w:hint="default"/>
+        <w:sz w:val="20"/>
+      </w:rPr>
+    </w:lvl>
+    <w:lvl w:ilvl="1" w:tentative="1">
+      <w:start w:val="1"/>
+      <w:numFmt w:val="bullet"/>
+      <w:lvlText w:val="o"/>
+      <w:lvlJc w:val="left"/>
+      <w:pPr>
+        <w:tabs>
+          <w:tab w:val="num" w:pos="1440"/>
+        </w:tabs>
+        <w:ind w:left="1440" w:hanging="360"/>
+      </w:pPr>
+      <w:rPr>
+        <w:rFonts w:ascii="Courier New" w:hAnsi="Courier New" w:hint="default"/>
+        <w:sz w:val="20"/>
+      </w:rPr>
+    </w:lvl>
+    <w:lvl w:ilvl="2" w:tentative="1">
+      <w:start w:val="1"/>
+      <w:numFmt w:val="bullet"/>
+      <w:lvlText w:val=""/>
+      <w:lvlJc w:val="left"/>
+      <w:pPr>
+        <w:tabs>
+          <w:tab w:val="num" w:pos="2160"/>
+        </w:tabs>
+        <w:ind w:left="2160" w:hanging="360"/>
+      </w:pPr>
+      <w:rPr>
+        <w:rFonts w:ascii="Wingdings" w:hAnsi="Wingdings" w:hint="default"/>
+        <w:sz w:val="20"/>
+      </w:rPr>
+    </w:lvl>
+    <w:lvl w:ilvl="3" w:tentative="1">
+      <w:start w:val="1"/>
+      <w:numFmt w:val="bullet"/>
+      <w:lvlText w:val=""/>
+      <w:lvlJc w:val="left"/>
+      <w:pPr>
+        <w:tabs>
+          <w:tab w:val="num" w:pos="2880"/>
+        </w:tabs>
+        <w:ind w:left="2880" w:hanging="360"/>
+      </w:pPr>
+      <w:rPr>
+        <w:rFonts w:ascii="Wingdings" w:hAnsi="Wingdings" w:hint="default"/>
+        <w:sz w:val="20"/>
+      </w:rPr>
+    </w:lvl>
+    <w:lvl w:ilvl="4" w:tentative="1">
+      <w:start w:val="1"/>
+      <w:numFmt w:val="bullet"/>
+      <w:lvlText w:val=""/>
+      <w:lvlJc w:val="left"/>
+      <w:pPr>
+        <w:tabs>
+          <w:tab w:val="num" w:pos="3600"/>
+        </w:tabs>
+        <w:ind w:left="3600" w:hanging="360"/>
+      </w:pPr>
+      <w:rPr>
+        <w:rFonts w:ascii="Wingdings" w:hAnsi="Wingdings" w:hint="default"/>
+        <w:sz w:val="20"/>
+      </w:rPr>
+    </w:lvl>
+    <w:lvl w:ilvl="5" w:tentative="1">
+      <w:start w:val="1"/>
+      <w:numFmt w:val="bullet"/>
+      <w:lvlText w:val=""/>
+      <w:lvlJc w:val="left"/>
+      <w:pPr>
+        <w:tabs>
+          <w:tab w:val="num" w:pos="4320"/>
+        </w:tabs>
+        <w:ind w:left="4320" w:hanging="360"/>
+      </w:pPr>
+      <w:rPr>
+        <w:rFonts w:ascii="Wingdings" w:hAnsi="Wingdings" w:hint="default"/>
+        <w:sz w:val="20"/>
+      </w:rPr>
+    </w:lvl>
+    <w:lvl w:ilvl="6" w:tentative="1">
+      <w:start w:val="1"/>
+      <w:numFmt w:val="bullet"/>
+      <w:lvlText w:val=""/>
+      <w:lvlJc w:val="left"/>
+      <w:pPr>
+        <w:tabs>
+          <w:tab w:val="num" w:pos="5040"/>
+        </w:tabs>
+        <w:ind w:left="5040" w:hanging="360"/>
+      </w:pPr>
+      <w:rPr>
+        <w:rFonts w:ascii="Wingdings" w:hAnsi="Wingdings" w:hint="default"/>
+        <w:sz w:val="20"/>
+      </w:rPr>
+    </w:lvl>
+    <w:lvl w:ilvl="7" w:tentative="1">
+      <w:start w:val="1"/>
+      <w:numFmt w:val="bullet"/>
+      <w:lvlText w:val=""/>
+      <w:lvlJc w:val="left"/>
+      <w:pPr>
+        <w:tabs>
+          <w:tab w:val="num" w:pos="5760"/>
+        </w:tabs>
+        <w:ind w:left="5760" w:hanging="360"/>
+      </w:pPr>
+      <w:rPr>
+        <w:rFonts w:ascii="Wingdings" w:hAnsi="Wingdings" w:hint="default"/>
+        <w:sz w:val="20"/>
+      </w:rPr>
+    </w:lvl>
+    <w:lvl w:ilvl="8" w:tentative="1">
+      <w:start w:val="1"/>
+      <w:numFmt w:val="bullet"/>
+      <w:lvlText w:val=""/>
+      <w:lvlJc w:val="left"/>
+      <w:pPr>
+        <w:tabs>
+          <w:tab w:val="num" w:pos="6480"/>
+        </w:tabs>
+        <w:ind w:left="6480" w:hanging="360"/>
+      </w:pPr>
+      <w:rPr>
+        <w:rFonts w:ascii="Wingdings" w:hAnsi="Wingdings" w:hint="default"/>
+        <w:sz w:val="20"/>
+      </w:rPr>
+    </w:lvl>
+  </w:abstractNum>
+  <w:num w:numId="1" w16cid:durableId="1493790006">
+    <w:abstractNumId w:val="0"/>
+  </w:num>
+  <w:num w:numId="2" w16cid:durableId="591082547">
+    <w:abstractNumId w:val="1"/>
+  </w:num>
+</w:numbering>
 </file>
 
 <file path=word/styles.xml><?xml version="1.0" encoding="utf-8"?>
@@ -941,7 +1512,6 @@
   <w:style w:type="character" w:default="1" w:styleId="Domylnaczcionkaakapitu">
     <w:name w:val="Default Paragraph Font"/>
     <w:uiPriority w:val="1"/>
-    <w:semiHidden/>
     <w:unhideWhenUsed/>
   </w:style>
   <w:style w:type="table" w:default="1" w:styleId="Standardowy">

</xml_diff>